<commit_message>
Budget variances lesson v1.4: A4, clearer minus-sign rule, more answer space
Co-Authored-By: Claude Opus 5.5 <noreply@anthropic.com>
</commit_message>
<xml_diff>
--- a/resources/a-level-business-budget-variances-cafe/A-Level-Business-Budget-Variances-Cafe-Student.docx
+++ b/resources/a-level-business-budget-variances-cafe/A-Level-Business-Budget-Variances-Cafe-Student.docx
@@ -35,7 +35,7 @@
     </w:p>
     <w:p>
       <w:r>
-        <w:t>Write F or A: (i) revenue is £500 above budget ___ (ii) energy costs are £200 above budget ___ (iii) marketing costs are £100 below budget ___ (iv) revenue is £300 below budget ___</w:t>
+        <w:t>Write F or A: (i) revenue is £500 above budget _______ (ii) energy costs are £200 above budget _______ (iii) marketing costs are £100 below budget _______ (iv) revenue is £300 below budget _______</w:t>
       </w:r>
     </w:p>
     <w:p>
@@ -53,14 +53,14 @@
         <w:tblLook w:firstColumn="1" w:firstRow="1" w:lastColumn="0" w:lastRow="0" w:noHBand="0" w:noVBand="1" w:val="04A0"/>
       </w:tblPr>
       <w:tblGrid>
-        <w:gridCol w:w="5256"/>
-        <w:gridCol w:w="2628"/>
-        <w:gridCol w:w="2628"/>
+        <w:gridCol w:w="5076"/>
+        <w:gridCol w:w="2538"/>
+        <w:gridCol w:w="2538"/>
       </w:tblGrid>
       <w:tr>
         <w:tc>
           <w:tcPr>
-            <w:tcW w:type="dxa" w:w="5256"/>
+            <w:tcW w:type="dxa" w:w="5076"/>
             <w:shd w:fill="142D40"/>
             <w:tcBorders>
               <w:top w:val="single" w:sz="4" w:color="D9D9D9"/>
@@ -91,7 +91,7 @@
         </w:tc>
         <w:tc>
           <w:tcPr>
-            <w:tcW w:type="dxa" w:w="2628"/>
+            <w:tcW w:type="dxa" w:w="2538"/>
             <w:shd w:fill="142D40"/>
             <w:tcBorders>
               <w:top w:val="single" w:sz="4" w:color="D9D9D9"/>
@@ -122,7 +122,7 @@
         </w:tc>
         <w:tc>
           <w:tcPr>
-            <w:tcW w:type="dxa" w:w="2628"/>
+            <w:tcW w:type="dxa" w:w="2538"/>
             <w:shd w:fill="142D40"/>
             <w:tcBorders>
               <w:top w:val="single" w:sz="4" w:color="D9D9D9"/>
@@ -155,7 +155,7 @@
       <w:tr>
         <w:tc>
           <w:tcPr>
-            <w:tcW w:type="dxa" w:w="5256"/>
+            <w:tcW w:type="dxa" w:w="5076"/>
             <w:shd w:fill="FFFFFF"/>
             <w:tcBorders>
               <w:top w:val="single" w:sz="4" w:color="D9D9D9"/>
@@ -186,7 +186,7 @@
         </w:tc>
         <w:tc>
           <w:tcPr>
-            <w:tcW w:type="dxa" w:w="2628"/>
+            <w:tcW w:type="dxa" w:w="2538"/>
             <w:shd w:fill="FFFFFF"/>
             <w:tcBorders>
               <w:top w:val="single" w:sz="4" w:color="D9D9D9"/>
@@ -217,7 +217,7 @@
         </w:tc>
         <w:tc>
           <w:tcPr>
-            <w:tcW w:type="dxa" w:w="2628"/>
+            <w:tcW w:type="dxa" w:w="2538"/>
             <w:shd w:fill="FFFFFF"/>
             <w:tcBorders>
               <w:top w:val="single" w:sz="4" w:color="D9D9D9"/>
@@ -250,7 +250,7 @@
       <w:tr>
         <w:tc>
           <w:tcPr>
-            <w:tcW w:type="dxa" w:w="5256"/>
+            <w:tcW w:type="dxa" w:w="5076"/>
             <w:shd w:fill="F1F5F7"/>
             <w:tcBorders>
               <w:top w:val="single" w:sz="4" w:color="D9D9D9"/>
@@ -281,7 +281,7 @@
         </w:tc>
         <w:tc>
           <w:tcPr>
-            <w:tcW w:type="dxa" w:w="2628"/>
+            <w:tcW w:type="dxa" w:w="2538"/>
             <w:shd w:fill="F1F5F7"/>
             <w:tcBorders>
               <w:top w:val="single" w:sz="4" w:color="D9D9D9"/>
@@ -312,7 +312,7 @@
         </w:tc>
         <w:tc>
           <w:tcPr>
-            <w:tcW w:type="dxa" w:w="2628"/>
+            <w:tcW w:type="dxa" w:w="2538"/>
             <w:shd w:fill="F1F5F7"/>
             <w:tcBorders>
               <w:top w:val="single" w:sz="4" w:color="D9D9D9"/>
@@ -345,7 +345,7 @@
       <w:tr>
         <w:tc>
           <w:tcPr>
-            <w:tcW w:type="dxa" w:w="5256"/>
+            <w:tcW w:type="dxa" w:w="5076"/>
             <w:shd w:fill="FFFFFF"/>
             <w:tcBorders>
               <w:top w:val="single" w:sz="4" w:color="D9D9D9"/>
@@ -376,7 +376,7 @@
         </w:tc>
         <w:tc>
           <w:tcPr>
-            <w:tcW w:type="dxa" w:w="2628"/>
+            <w:tcW w:type="dxa" w:w="2538"/>
             <w:shd w:fill="FFFFFF"/>
             <w:tcBorders>
               <w:top w:val="single" w:sz="4" w:color="D9D9D9"/>
@@ -407,7 +407,7 @@
         </w:tc>
         <w:tc>
           <w:tcPr>
-            <w:tcW w:type="dxa" w:w="2628"/>
+            <w:tcW w:type="dxa" w:w="2538"/>
             <w:shd w:fill="FFFFFF"/>
             <w:tcBorders>
               <w:top w:val="single" w:sz="4" w:color="D9D9D9"/>
@@ -440,7 +440,7 @@
       <w:tr>
         <w:tc>
           <w:tcPr>
-            <w:tcW w:type="dxa" w:w="5256"/>
+            <w:tcW w:type="dxa" w:w="5076"/>
             <w:shd w:fill="F1F5F7"/>
             <w:tcBorders>
               <w:top w:val="single" w:sz="4" w:color="D9D9D9"/>
@@ -471,7 +471,7 @@
         </w:tc>
         <w:tc>
           <w:tcPr>
-            <w:tcW w:type="dxa" w:w="2628"/>
+            <w:tcW w:type="dxa" w:w="2538"/>
             <w:shd w:fill="F1F5F7"/>
             <w:tcBorders>
               <w:top w:val="single" w:sz="4" w:color="D9D9D9"/>
@@ -502,7 +502,7 @@
         </w:tc>
         <w:tc>
           <w:tcPr>
-            <w:tcW w:type="dxa" w:w="2628"/>
+            <w:tcW w:type="dxa" w:w="2538"/>
             <w:shd w:fill="F1F5F7"/>
             <w:tcBorders>
               <w:top w:val="single" w:sz="4" w:color="D9D9D9"/>
@@ -535,7 +535,7 @@
       <w:tr>
         <w:tc>
           <w:tcPr>
-            <w:tcW w:type="dxa" w:w="5256"/>
+            <w:tcW w:type="dxa" w:w="5076"/>
             <w:shd w:fill="FFFFFF"/>
             <w:tcBorders>
               <w:top w:val="single" w:sz="4" w:color="D9D9D9"/>
@@ -566,7 +566,7 @@
         </w:tc>
         <w:tc>
           <w:tcPr>
-            <w:tcW w:type="dxa" w:w="2628"/>
+            <w:tcW w:type="dxa" w:w="2538"/>
             <w:shd w:fill="FFFFFF"/>
             <w:tcBorders>
               <w:top w:val="single" w:sz="4" w:color="D9D9D9"/>
@@ -597,7 +597,7 @@
         </w:tc>
         <w:tc>
           <w:tcPr>
-            <w:tcW w:type="dxa" w:w="2628"/>
+            <w:tcW w:type="dxa" w:w="2538"/>
             <w:shd w:fill="FFFFFF"/>
             <w:tcBorders>
               <w:top w:val="single" w:sz="4" w:color="D9D9D9"/>
@@ -630,7 +630,7 @@
       <w:tr>
         <w:tc>
           <w:tcPr>
-            <w:tcW w:type="dxa" w:w="5256"/>
+            <w:tcW w:type="dxa" w:w="5076"/>
             <w:shd w:fill="F1F5F7"/>
             <w:tcBorders>
               <w:top w:val="single" w:sz="4" w:color="D9D9D9"/>
@@ -661,7 +661,7 @@
         </w:tc>
         <w:tc>
           <w:tcPr>
-            <w:tcW w:type="dxa" w:w="2628"/>
+            <w:tcW w:type="dxa" w:w="2538"/>
             <w:shd w:fill="F1F5F7"/>
             <w:tcBorders>
               <w:top w:val="single" w:sz="4" w:color="D9D9D9"/>
@@ -692,7 +692,7 @@
         </w:tc>
         <w:tc>
           <w:tcPr>
-            <w:tcW w:type="dxa" w:w="2628"/>
+            <w:tcW w:type="dxa" w:w="2538"/>
             <w:shd w:fill="F1F5F7"/>
             <w:tcBorders>
               <w:top w:val="single" w:sz="4" w:color="D9D9D9"/>
@@ -725,7 +725,7 @@
       <w:tr>
         <w:tc>
           <w:tcPr>
-            <w:tcW w:type="dxa" w:w="5256"/>
+            <w:tcW w:type="dxa" w:w="5076"/>
             <w:shd w:fill="FFFFFF"/>
             <w:tcBorders>
               <w:top w:val="single" w:sz="4" w:color="D9D9D9"/>
@@ -756,7 +756,7 @@
         </w:tc>
         <w:tc>
           <w:tcPr>
-            <w:tcW w:type="dxa" w:w="2628"/>
+            <w:tcW w:type="dxa" w:w="2538"/>
             <w:shd w:fill="FFFFFF"/>
             <w:tcBorders>
               <w:top w:val="single" w:sz="4" w:color="D9D9D9"/>
@@ -787,7 +787,7 @@
         </w:tc>
         <w:tc>
           <w:tcPr>
-            <w:tcW w:type="dxa" w:w="2628"/>
+            <w:tcW w:type="dxa" w:w="2538"/>
             <w:shd w:fill="FFFFFF"/>
             <w:tcBorders>
               <w:top w:val="single" w:sz="4" w:color="D9D9D9"/>
@@ -848,15 +848,15 @@
         <w:tblLook w:firstColumn="1" w:firstRow="1" w:lastColumn="0" w:lastRow="0" w:noHBand="0" w:noVBand="1" w:val="04A0"/>
       </w:tblPr>
       <w:tblGrid>
-        <w:gridCol w:w="3574"/>
-        <w:gridCol w:w="2313"/>
-        <w:gridCol w:w="2733"/>
-        <w:gridCol w:w="1892"/>
+        <w:gridCol w:w="3452"/>
+        <w:gridCol w:w="2233"/>
+        <w:gridCol w:w="2640"/>
+        <w:gridCol w:w="1827"/>
       </w:tblGrid>
       <w:tr>
         <w:tc>
           <w:tcPr>
-            <w:tcW w:type="dxa" w:w="3574"/>
+            <w:tcW w:type="dxa" w:w="3452"/>
             <w:shd w:fill="142D40"/>
             <w:tcBorders>
               <w:top w:val="single" w:sz="4" w:color="D9D9D9"/>
@@ -887,7 +887,7 @@
         </w:tc>
         <w:tc>
           <w:tcPr>
-            <w:tcW w:type="dxa" w:w="2313"/>
+            <w:tcW w:type="dxa" w:w="2233"/>
             <w:shd w:fill="142D40"/>
             <w:tcBorders>
               <w:top w:val="single" w:sz="4" w:color="D9D9D9"/>
@@ -918,7 +918,7 @@
         </w:tc>
         <w:tc>
           <w:tcPr>
-            <w:tcW w:type="dxa" w:w="2733"/>
+            <w:tcW w:type="dxa" w:w="2640"/>
             <w:shd w:fill="142D40"/>
             <w:tcBorders>
               <w:top w:val="single" w:sz="4" w:color="D9D9D9"/>
@@ -949,7 +949,7 @@
         </w:tc>
         <w:tc>
           <w:tcPr>
-            <w:tcW w:type="dxa" w:w="1892"/>
+            <w:tcW w:type="dxa" w:w="1827"/>
             <w:shd w:fill="142D40"/>
             <w:tcBorders>
               <w:top w:val="single" w:sz="4" w:color="D9D9D9"/>
@@ -982,7 +982,7 @@
       <w:tr>
         <w:tc>
           <w:tcPr>
-            <w:tcW w:type="dxa" w:w="3574"/>
+            <w:tcW w:type="dxa" w:w="3452"/>
             <w:shd w:fill="FFFFFF"/>
             <w:tcBorders>
               <w:top w:val="single" w:sz="4" w:color="D9D9D9"/>
@@ -1013,7 +1013,7 @@
         </w:tc>
         <w:tc>
           <w:tcPr>
-            <w:tcW w:type="dxa" w:w="2313"/>
+            <w:tcW w:type="dxa" w:w="2233"/>
             <w:shd w:fill="FFFFFF"/>
             <w:tcBorders>
               <w:top w:val="single" w:sz="4" w:color="D9D9D9"/>
@@ -1044,7 +1044,7 @@
         </w:tc>
         <w:tc>
           <w:tcPr>
-            <w:tcW w:type="dxa" w:w="2733"/>
+            <w:tcW w:type="dxa" w:w="2640"/>
             <w:shd w:fill="FFFFFF"/>
             <w:tcBorders>
               <w:top w:val="single" w:sz="4" w:color="D9D9D9"/>
@@ -1075,7 +1075,7 @@
         </w:tc>
         <w:tc>
           <w:tcPr>
-            <w:tcW w:type="dxa" w:w="1892"/>
+            <w:tcW w:type="dxa" w:w="1827"/>
             <w:shd w:fill="FFFFFF"/>
             <w:tcBorders>
               <w:top w:val="single" w:sz="4" w:color="D9D9D9"/>
@@ -1108,7 +1108,7 @@
       <w:tr>
         <w:tc>
           <w:tcPr>
-            <w:tcW w:type="dxa" w:w="3574"/>
+            <w:tcW w:type="dxa" w:w="3452"/>
             <w:shd w:fill="F1F5F7"/>
             <w:tcBorders>
               <w:top w:val="single" w:sz="4" w:color="D9D9D9"/>
@@ -1139,7 +1139,7 @@
         </w:tc>
         <w:tc>
           <w:tcPr>
-            <w:tcW w:type="dxa" w:w="2313"/>
+            <w:tcW w:type="dxa" w:w="2233"/>
             <w:shd w:fill="F1F5F7"/>
             <w:tcBorders>
               <w:top w:val="single" w:sz="4" w:color="D9D9D9"/>
@@ -1169,7 +1169,7 @@
         </w:tc>
         <w:tc>
           <w:tcPr>
-            <w:tcW w:type="dxa" w:w="2733"/>
+            <w:tcW w:type="dxa" w:w="2640"/>
             <w:shd w:fill="F1F5F7"/>
             <w:tcBorders>
               <w:top w:val="single" w:sz="4" w:color="D9D9D9"/>
@@ -1199,7 +1199,7 @@
         </w:tc>
         <w:tc>
           <w:tcPr>
-            <w:tcW w:type="dxa" w:w="1892"/>
+            <w:tcW w:type="dxa" w:w="1827"/>
             <w:shd w:fill="F1F5F7"/>
             <w:tcBorders>
               <w:top w:val="single" w:sz="4" w:color="D9D9D9"/>
@@ -1231,7 +1231,7 @@
       <w:tr>
         <w:tc>
           <w:tcPr>
-            <w:tcW w:type="dxa" w:w="3574"/>
+            <w:tcW w:type="dxa" w:w="3452"/>
             <w:shd w:fill="FFFFFF"/>
             <w:tcBorders>
               <w:top w:val="single" w:sz="4" w:color="D9D9D9"/>
@@ -1262,7 +1262,7 @@
         </w:tc>
         <w:tc>
           <w:tcPr>
-            <w:tcW w:type="dxa" w:w="2313"/>
+            <w:tcW w:type="dxa" w:w="2233"/>
             <w:shd w:fill="FFFFFF"/>
             <w:tcBorders>
               <w:top w:val="single" w:sz="4" w:color="D9D9D9"/>
@@ -1292,7 +1292,7 @@
         </w:tc>
         <w:tc>
           <w:tcPr>
-            <w:tcW w:type="dxa" w:w="2733"/>
+            <w:tcW w:type="dxa" w:w="2640"/>
             <w:shd w:fill="FFFFFF"/>
             <w:tcBorders>
               <w:top w:val="single" w:sz="4" w:color="D9D9D9"/>
@@ -1322,7 +1322,7 @@
         </w:tc>
         <w:tc>
           <w:tcPr>
-            <w:tcW w:type="dxa" w:w="1892"/>
+            <w:tcW w:type="dxa" w:w="1827"/>
             <w:shd w:fill="FFFFFF"/>
             <w:tcBorders>
               <w:top w:val="single" w:sz="4" w:color="D9D9D9"/>
@@ -1354,7 +1354,7 @@
       <w:tr>
         <w:tc>
           <w:tcPr>
-            <w:tcW w:type="dxa" w:w="3574"/>
+            <w:tcW w:type="dxa" w:w="3452"/>
             <w:shd w:fill="F1F5F7"/>
             <w:tcBorders>
               <w:top w:val="single" w:sz="4" w:color="D9D9D9"/>
@@ -1385,7 +1385,7 @@
         </w:tc>
         <w:tc>
           <w:tcPr>
-            <w:tcW w:type="dxa" w:w="2313"/>
+            <w:tcW w:type="dxa" w:w="2233"/>
             <w:shd w:fill="F1F5F7"/>
             <w:tcBorders>
               <w:top w:val="single" w:sz="4" w:color="D9D9D9"/>
@@ -1415,7 +1415,7 @@
         </w:tc>
         <w:tc>
           <w:tcPr>
-            <w:tcW w:type="dxa" w:w="2733"/>
+            <w:tcW w:type="dxa" w:w="2640"/>
             <w:shd w:fill="F1F5F7"/>
             <w:tcBorders>
               <w:top w:val="single" w:sz="4" w:color="D9D9D9"/>
@@ -1445,7 +1445,7 @@
         </w:tc>
         <w:tc>
           <w:tcPr>
-            <w:tcW w:type="dxa" w:w="1892"/>
+            <w:tcW w:type="dxa" w:w="1827"/>
             <w:shd w:fill="F1F5F7"/>
             <w:tcBorders>
               <w:top w:val="single" w:sz="4" w:color="D9D9D9"/>
@@ -1477,7 +1477,7 @@
       <w:tr>
         <w:tc>
           <w:tcPr>
-            <w:tcW w:type="dxa" w:w="3574"/>
+            <w:tcW w:type="dxa" w:w="3452"/>
             <w:shd w:fill="FFFFFF"/>
             <w:tcBorders>
               <w:top w:val="single" w:sz="4" w:color="D9D9D9"/>
@@ -1508,7 +1508,7 @@
         </w:tc>
         <w:tc>
           <w:tcPr>
-            <w:tcW w:type="dxa" w:w="2313"/>
+            <w:tcW w:type="dxa" w:w="2233"/>
             <w:shd w:fill="FFFFFF"/>
             <w:tcBorders>
               <w:top w:val="single" w:sz="4" w:color="D9D9D9"/>
@@ -1538,7 +1538,7 @@
         </w:tc>
         <w:tc>
           <w:tcPr>
-            <w:tcW w:type="dxa" w:w="2733"/>
+            <w:tcW w:type="dxa" w:w="2640"/>
             <w:shd w:fill="FFFFFF"/>
             <w:tcBorders>
               <w:top w:val="single" w:sz="4" w:color="D9D9D9"/>
@@ -1568,7 +1568,7 @@
         </w:tc>
         <w:tc>
           <w:tcPr>
-            <w:tcW w:type="dxa" w:w="1892"/>
+            <w:tcW w:type="dxa" w:w="1827"/>
             <w:shd w:fill="FFFFFF"/>
             <w:tcBorders>
               <w:top w:val="single" w:sz="4" w:color="D9D9D9"/>
@@ -1600,7 +1600,7 @@
       <w:tr>
         <w:tc>
           <w:tcPr>
-            <w:tcW w:type="dxa" w:w="3574"/>
+            <w:tcW w:type="dxa" w:w="3452"/>
             <w:shd w:fill="F1F5F7"/>
             <w:tcBorders>
               <w:top w:val="single" w:sz="4" w:color="D9D9D9"/>
@@ -1631,7 +1631,7 @@
         </w:tc>
         <w:tc>
           <w:tcPr>
-            <w:tcW w:type="dxa" w:w="2313"/>
+            <w:tcW w:type="dxa" w:w="2233"/>
             <w:shd w:fill="F1F5F7"/>
             <w:tcBorders>
               <w:top w:val="single" w:sz="4" w:color="D9D9D9"/>
@@ -1661,7 +1661,7 @@
         </w:tc>
         <w:tc>
           <w:tcPr>
-            <w:tcW w:type="dxa" w:w="2733"/>
+            <w:tcW w:type="dxa" w:w="2640"/>
             <w:shd w:fill="F1F5F7"/>
             <w:tcBorders>
               <w:top w:val="single" w:sz="4" w:color="D9D9D9"/>
@@ -1691,7 +1691,7 @@
         </w:tc>
         <w:tc>
           <w:tcPr>
-            <w:tcW w:type="dxa" w:w="1892"/>
+            <w:tcW w:type="dxa" w:w="1827"/>
             <w:shd w:fill="F1F5F7"/>
             <w:tcBorders>
               <w:top w:val="single" w:sz="4" w:color="D9D9D9"/>
@@ -1723,7 +1723,7 @@
       <w:tr>
         <w:tc>
           <w:tcPr>
-            <w:tcW w:type="dxa" w:w="3574"/>
+            <w:tcW w:type="dxa" w:w="3452"/>
             <w:shd w:fill="FFFFFF"/>
             <w:tcBorders>
               <w:top w:val="single" w:sz="4" w:color="D9D9D9"/>
@@ -1754,7 +1754,7 @@
         </w:tc>
         <w:tc>
           <w:tcPr>
-            <w:tcW w:type="dxa" w:w="2313"/>
+            <w:tcW w:type="dxa" w:w="2233"/>
             <w:shd w:fill="FFFFFF"/>
             <w:tcBorders>
               <w:top w:val="single" w:sz="4" w:color="D9D9D9"/>
@@ -1784,7 +1784,7 @@
         </w:tc>
         <w:tc>
           <w:tcPr>
-            <w:tcW w:type="dxa" w:w="2733"/>
+            <w:tcW w:type="dxa" w:w="2640"/>
             <w:shd w:fill="FFFFFF"/>
             <w:tcBorders>
               <w:top w:val="single" w:sz="4" w:color="D9D9D9"/>
@@ -1814,7 +1814,7 @@
         </w:tc>
         <w:tc>
           <w:tcPr>
-            <w:tcW w:type="dxa" w:w="1892"/>
+            <w:tcW w:type="dxa" w:w="1827"/>
             <w:shd w:fill="FFFFFF"/>
             <w:tcBorders>
               <w:top w:val="single" w:sz="4" w:color="D9D9D9"/>
@@ -1856,6 +1856,70 @@
     </w:p>
     <w:p>
       <w:r>
+        <w:t>Working space for the percentages:</w:t>
+      </w:r>
+    </w:p>
+    <w:p>
+      <w:pPr>
+        <w:pBdr>
+          <w:bottom w:val="single" w:sz="4" w:space="1" w:color="CDD3D9"/>
+          <w:between w:val="single" w:sz="4" w:space="1" w:color="CDD3D9"/>
+        </w:pBdr>
+        <w:spacing w:before="0" w:after="0" w:line="500" w:lineRule="exact"/>
+      </w:pPr>
+    </w:p>
+    <w:p>
+      <w:pPr>
+        <w:pBdr>
+          <w:bottom w:val="single" w:sz="4" w:space="1" w:color="CDD3D9"/>
+          <w:between w:val="single" w:sz="4" w:space="1" w:color="CDD3D9"/>
+        </w:pBdr>
+        <w:spacing w:before="0" w:after="0" w:line="500" w:lineRule="exact"/>
+      </w:pPr>
+    </w:p>
+    <w:p>
+      <w:pPr>
+        <w:pBdr>
+          <w:bottom w:val="single" w:sz="4" w:space="1" w:color="CDD3D9"/>
+          <w:between w:val="single" w:sz="4" w:space="1" w:color="CDD3D9"/>
+        </w:pBdr>
+        <w:spacing w:before="0" w:after="0" w:line="500" w:lineRule="exact"/>
+      </w:pPr>
+    </w:p>
+    <w:p>
+      <w:pPr>
+        <w:pBdr>
+          <w:bottom w:val="single" w:sz="4" w:space="1" w:color="CDD3D9"/>
+          <w:between w:val="single" w:sz="4" w:space="1" w:color="CDD3D9"/>
+        </w:pBdr>
+        <w:spacing w:before="0" w:after="0" w:line="500" w:lineRule="exact"/>
+      </w:pPr>
+    </w:p>
+    <w:p>
+      <w:pPr>
+        <w:pBdr>
+          <w:bottom w:val="single" w:sz="4" w:space="1" w:color="CDD3D9"/>
+          <w:between w:val="single" w:sz="4" w:space="1" w:color="CDD3D9"/>
+        </w:pBdr>
+        <w:spacing w:before="0" w:after="0" w:line="500" w:lineRule="exact"/>
+      </w:pPr>
+    </w:p>
+    <w:p>
+      <w:pPr>
+        <w:pBdr>
+          <w:bottom w:val="single" w:sz="4" w:space="1" w:color="CDD3D9"/>
+          <w:between w:val="single" w:sz="4" w:space="1" w:color="CDD3D9"/>
+        </w:pBdr>
+        <w:spacing w:before="0" w:after="0" w:line="500" w:lineRule="exact"/>
+      </w:pPr>
+    </w:p>
+    <w:p>
+      <w:pPr>
+        <w:spacing w:after="0" w:line="140" w:lineRule="exact"/>
+      </w:pPr>
+    </w:p>
+    <w:p>
+      <w:r>
         <w:t>b. Profit = revenue - total costs. Complete the table.</w:t>
       </w:r>
     </w:p>
@@ -1866,15 +1930,15 @@
         <w:tblLook w:firstColumn="1" w:firstRow="1" w:lastColumn="0" w:lastRow="0" w:noHBand="0" w:noVBand="1" w:val="04A0"/>
       </w:tblPr>
       <w:tblGrid>
-        <w:gridCol w:w="4205"/>
-        <w:gridCol w:w="2102"/>
-        <w:gridCol w:w="2102"/>
-        <w:gridCol w:w="2102"/>
+        <w:gridCol w:w="4061"/>
+        <w:gridCol w:w="2030"/>
+        <w:gridCol w:w="2030"/>
+        <w:gridCol w:w="2030"/>
       </w:tblGrid>
       <w:tr>
         <w:tc>
           <w:tcPr>
-            <w:tcW w:type="dxa" w:w="4205"/>
+            <w:tcW w:type="dxa" w:w="4061"/>
             <w:shd w:fill="142D40"/>
             <w:tcBorders>
               <w:top w:val="single" w:sz="4" w:color="D9D9D9"/>
@@ -1905,7 +1969,7 @@
         </w:tc>
         <w:tc>
           <w:tcPr>
-            <w:tcW w:type="dxa" w:w="2102"/>
+            <w:tcW w:type="dxa" w:w="2030"/>
             <w:shd w:fill="142D40"/>
             <w:tcBorders>
               <w:top w:val="single" w:sz="4" w:color="D9D9D9"/>
@@ -1936,7 +2000,7 @@
         </w:tc>
         <w:tc>
           <w:tcPr>
-            <w:tcW w:type="dxa" w:w="2102"/>
+            <w:tcW w:type="dxa" w:w="2030"/>
             <w:shd w:fill="142D40"/>
             <w:tcBorders>
               <w:top w:val="single" w:sz="4" w:color="D9D9D9"/>
@@ -1967,7 +2031,7 @@
         </w:tc>
         <w:tc>
           <w:tcPr>
-            <w:tcW w:type="dxa" w:w="2102"/>
+            <w:tcW w:type="dxa" w:w="2030"/>
             <w:shd w:fill="142D40"/>
             <w:tcBorders>
               <w:top w:val="single" w:sz="4" w:color="D9D9D9"/>
@@ -2000,7 +2064,7 @@
       <w:tr>
         <w:tc>
           <w:tcPr>
-            <w:tcW w:type="dxa" w:w="4205"/>
+            <w:tcW w:type="dxa" w:w="4061"/>
             <w:shd w:fill="FFFFFF"/>
             <w:tcBorders>
               <w:top w:val="single" w:sz="4" w:color="D9D9D9"/>
@@ -2031,7 +2095,7 @@
         </w:tc>
         <w:tc>
           <w:tcPr>
-            <w:tcW w:type="dxa" w:w="2102"/>
+            <w:tcW w:type="dxa" w:w="2030"/>
             <w:shd w:fill="FFFFFF"/>
             <w:tcBorders>
               <w:top w:val="single" w:sz="4" w:color="D9D9D9"/>
@@ -2061,7 +2125,7 @@
         </w:tc>
         <w:tc>
           <w:tcPr>
-            <w:tcW w:type="dxa" w:w="2102"/>
+            <w:tcW w:type="dxa" w:w="2030"/>
             <w:shd w:fill="FFFFFF"/>
             <w:tcBorders>
               <w:top w:val="single" w:sz="4" w:color="D9D9D9"/>
@@ -2091,7 +2155,7 @@
         </w:tc>
         <w:tc>
           <w:tcPr>
-            <w:tcW w:type="dxa" w:w="2102"/>
+            <w:tcW w:type="dxa" w:w="2030"/>
             <w:shd w:fill="FFFFFF"/>
             <w:tcBorders>
               <w:top w:val="single" w:sz="4" w:color="D9D9D9"/>
@@ -2123,7 +2187,7 @@
       <w:tr>
         <w:tc>
           <w:tcPr>
-            <w:tcW w:type="dxa" w:w="4205"/>
+            <w:tcW w:type="dxa" w:w="4061"/>
             <w:shd w:fill="F1F5F7"/>
             <w:tcBorders>
               <w:top w:val="single" w:sz="4" w:color="D9D9D9"/>
@@ -2154,7 +2218,7 @@
         </w:tc>
         <w:tc>
           <w:tcPr>
-            <w:tcW w:type="dxa" w:w="2102"/>
+            <w:tcW w:type="dxa" w:w="2030"/>
             <w:shd w:fill="F1F5F7"/>
             <w:tcBorders>
               <w:top w:val="single" w:sz="4" w:color="D9D9D9"/>
@@ -2184,7 +2248,7 @@
         </w:tc>
         <w:tc>
           <w:tcPr>
-            <w:tcW w:type="dxa" w:w="2102"/>
+            <w:tcW w:type="dxa" w:w="2030"/>
             <w:shd w:fill="F1F5F7"/>
             <w:tcBorders>
               <w:top w:val="single" w:sz="4" w:color="D9D9D9"/>
@@ -2214,7 +2278,7 @@
         </w:tc>
         <w:tc>
           <w:tcPr>
-            <w:tcW w:type="dxa" w:w="2102"/>
+            <w:tcW w:type="dxa" w:w="2030"/>
             <w:shd w:fill="F1F5F7"/>
             <w:tcBorders>
               <w:top w:val="single" w:sz="4" w:color="D9D9D9"/>
@@ -2250,6 +2314,11 @@
       </w:pPr>
     </w:p>
     <w:p>
+      <w:r>
+        <w:br w:type="page"/>
+      </w:r>
+    </w:p>
+    <w:p>
       <w:pPr>
         <w:pStyle w:val="Heading1"/>
       </w:pPr>
@@ -2259,61 +2328,81 @@
     </w:p>
     <w:p>
       <w:r>
-        <w:t>The owner only investigates a variance if it is more than £250 or more than 20% of the budgeted figure.</w:t>
+        <w:t>The owner only investigates a variance if it is more than £250 or more than 20% of the budgeted figure. Compare sizes only: ignore any minus sign.</w:t>
       </w:r>
     </w:p>
     <w:p>
       <w:r>
-        <w:t>a. Which lines meet this rule? Show the evidence for each line you include or leave out.</w:t>
+        <w:t>a. Which lines of the Task 1a table meet this rule? Show the evidence for each line you include or leave out.</w:t>
       </w:r>
     </w:p>
     <w:p>
       <w:pPr>
-        <w:spacing w:after="40"/>
+        <w:pBdr>
+          <w:bottom w:val="single" w:sz="4" w:space="1" w:color="CDD3D9"/>
+          <w:between w:val="single" w:sz="4" w:space="1" w:color="CDD3D9"/>
+        </w:pBdr>
+        <w:spacing w:before="0" w:after="0" w:line="500" w:lineRule="exact"/>
       </w:pPr>
-      <w:r>
-        <w:rPr>
-          <w:color w:val="CDD3D9"/>
-          <w:sz w:val="18"/>
-        </w:rPr>
-        <w:t>________________________________________________________________________________</w:t>
-      </w:r>
     </w:p>
     <w:p>
       <w:pPr>
-        <w:spacing w:after="40"/>
+        <w:pBdr>
+          <w:bottom w:val="single" w:sz="4" w:space="1" w:color="CDD3D9"/>
+          <w:between w:val="single" w:sz="4" w:space="1" w:color="CDD3D9"/>
+        </w:pBdr>
+        <w:spacing w:before="0" w:after="0" w:line="500" w:lineRule="exact"/>
       </w:pPr>
-      <w:r>
-        <w:rPr>
-          <w:color w:val="CDD3D9"/>
-          <w:sz w:val="18"/>
-        </w:rPr>
-        <w:t>________________________________________________________________________________</w:t>
-      </w:r>
     </w:p>
     <w:p>
       <w:pPr>
-        <w:spacing w:after="40"/>
+        <w:pBdr>
+          <w:bottom w:val="single" w:sz="4" w:space="1" w:color="CDD3D9"/>
+          <w:between w:val="single" w:sz="4" w:space="1" w:color="CDD3D9"/>
+        </w:pBdr>
+        <w:spacing w:before="0" w:after="0" w:line="500" w:lineRule="exact"/>
       </w:pPr>
-      <w:r>
-        <w:rPr>
-          <w:color w:val="CDD3D9"/>
-          <w:sz w:val="18"/>
-        </w:rPr>
-        <w:t>________________________________________________________________________________</w:t>
-      </w:r>
     </w:p>
     <w:p>
       <w:pPr>
-        <w:spacing w:after="40"/>
+        <w:pBdr>
+          <w:bottom w:val="single" w:sz="4" w:space="1" w:color="CDD3D9"/>
+          <w:between w:val="single" w:sz="4" w:space="1" w:color="CDD3D9"/>
+        </w:pBdr>
+        <w:spacing w:before="0" w:after="0" w:line="500" w:lineRule="exact"/>
       </w:pPr>
-      <w:r>
-        <w:rPr>
-          <w:color w:val="CDD3D9"/>
-          <w:sz w:val="18"/>
-        </w:rPr>
-        <w:t>________________________________________________________________________________</w:t>
-      </w:r>
+    </w:p>
+    <w:p>
+      <w:pPr>
+        <w:pBdr>
+          <w:bottom w:val="single" w:sz="4" w:space="1" w:color="CDD3D9"/>
+          <w:between w:val="single" w:sz="4" w:space="1" w:color="CDD3D9"/>
+        </w:pBdr>
+        <w:spacing w:before="0" w:after="0" w:line="500" w:lineRule="exact"/>
+      </w:pPr>
+    </w:p>
+    <w:p>
+      <w:pPr>
+        <w:pBdr>
+          <w:bottom w:val="single" w:sz="4" w:space="1" w:color="CDD3D9"/>
+          <w:between w:val="single" w:sz="4" w:space="1" w:color="CDD3D9"/>
+        </w:pBdr>
+        <w:spacing w:before="0" w:after="0" w:line="500" w:lineRule="exact"/>
+      </w:pPr>
+    </w:p>
+    <w:p>
+      <w:pPr>
+        <w:pBdr>
+          <w:bottom w:val="single" w:sz="4" w:space="1" w:color="CDD3D9"/>
+          <w:between w:val="single" w:sz="4" w:space="1" w:color="CDD3D9"/>
+        </w:pBdr>
+        <w:spacing w:before="0" w:after="0" w:line="500" w:lineRule="exact"/>
+      </w:pPr>
+    </w:p>
+    <w:p>
+      <w:pPr>
+        <w:spacing w:after="0" w:line="140" w:lineRule="exact"/>
+      </w:pPr>
     </w:p>
     <w:p>
       <w:r>
@@ -2322,32 +2411,26 @@
     </w:p>
     <w:p>
       <w:pPr>
-        <w:spacing w:after="40"/>
+        <w:pBdr>
+          <w:bottom w:val="single" w:sz="4" w:space="1" w:color="CDD3D9"/>
+          <w:between w:val="single" w:sz="4" w:space="1" w:color="CDD3D9"/>
+        </w:pBdr>
+        <w:spacing w:before="0" w:after="0" w:line="500" w:lineRule="exact"/>
       </w:pPr>
-      <w:r>
-        <w:rPr>
-          <w:color w:val="CDD3D9"/>
-          <w:sz w:val="18"/>
-        </w:rPr>
-        <w:t>________________________________________________________________________________</w:t>
-      </w:r>
     </w:p>
     <w:p>
       <w:pPr>
-        <w:spacing w:after="40"/>
+        <w:pBdr>
+          <w:bottom w:val="single" w:sz="4" w:space="1" w:color="CDD3D9"/>
+          <w:between w:val="single" w:sz="4" w:space="1" w:color="CDD3D9"/>
+        </w:pBdr>
+        <w:spacing w:before="0" w:after="0" w:line="500" w:lineRule="exact"/>
       </w:pPr>
-      <w:r>
-        <w:rPr>
-          <w:color w:val="CDD3D9"/>
-          <w:sz w:val="18"/>
-        </w:rPr>
-        <w:t>________________________________________________________________________________</w:t>
-      </w:r>
     </w:p>
     <w:p>
-      <w:r>
-        <w:br w:type="page"/>
-      </w:r>
+      <w:pPr>
+        <w:spacing w:after="0" w:line="140" w:lineRule="exact"/>
+      </w:pPr>
     </w:p>
     <w:p>
       <w:pPr>
@@ -2369,51 +2452,44 @@
     </w:p>
     <w:p>
       <w:pPr>
-        <w:spacing w:after="40"/>
+        <w:pBdr>
+          <w:bottom w:val="single" w:sz="4" w:space="1" w:color="CDD3D9"/>
+          <w:between w:val="single" w:sz="4" w:space="1" w:color="CDD3D9"/>
+        </w:pBdr>
+        <w:spacing w:before="0" w:after="0" w:line="500" w:lineRule="exact"/>
       </w:pPr>
-      <w:r>
-        <w:rPr>
-          <w:color w:val="CDD3D9"/>
-          <w:sz w:val="18"/>
-        </w:rPr>
-        <w:t>________________________________________________________________________________</w:t>
-      </w:r>
     </w:p>
     <w:p>
       <w:pPr>
-        <w:spacing w:after="40"/>
+        <w:pBdr>
+          <w:bottom w:val="single" w:sz="4" w:space="1" w:color="CDD3D9"/>
+          <w:between w:val="single" w:sz="4" w:space="1" w:color="CDD3D9"/>
+        </w:pBdr>
+        <w:spacing w:before="0" w:after="0" w:line="500" w:lineRule="exact"/>
       </w:pPr>
-      <w:r>
-        <w:rPr>
-          <w:color w:val="CDD3D9"/>
-          <w:sz w:val="18"/>
-        </w:rPr>
-        <w:t>________________________________________________________________________________</w:t>
-      </w:r>
     </w:p>
     <w:p>
       <w:pPr>
-        <w:spacing w:after="40"/>
+        <w:pBdr>
+          <w:bottom w:val="single" w:sz="4" w:space="1" w:color="CDD3D9"/>
+          <w:between w:val="single" w:sz="4" w:space="1" w:color="CDD3D9"/>
+        </w:pBdr>
+        <w:spacing w:before="0" w:after="0" w:line="500" w:lineRule="exact"/>
       </w:pPr>
-      <w:r>
-        <w:rPr>
-          <w:color w:val="CDD3D9"/>
-          <w:sz w:val="18"/>
-        </w:rPr>
-        <w:t>________________________________________________________________________________</w:t>
-      </w:r>
     </w:p>
     <w:p>
       <w:pPr>
-        <w:spacing w:after="40"/>
+        <w:pBdr>
+          <w:bottom w:val="single" w:sz="4" w:space="1" w:color="CDD3D9"/>
+          <w:between w:val="single" w:sz="4" w:space="1" w:color="CDD3D9"/>
+        </w:pBdr>
+        <w:spacing w:before="0" w:after="0" w:line="500" w:lineRule="exact"/>
       </w:pPr>
-      <w:r>
-        <w:rPr>
-          <w:color w:val="CDD3D9"/>
-          <w:sz w:val="18"/>
-        </w:rPr>
-        <w:t>________________________________________________________________________________</w:t>
-      </w:r>
+    </w:p>
+    <w:p>
+      <w:pPr>
+        <w:spacing w:after="0" w:line="140" w:lineRule="exact"/>
+      </w:pPr>
     </w:p>
     <w:p>
       <w:r>
@@ -2422,51 +2498,44 @@
     </w:p>
     <w:p>
       <w:pPr>
-        <w:spacing w:after="40"/>
+        <w:pBdr>
+          <w:bottom w:val="single" w:sz="4" w:space="1" w:color="CDD3D9"/>
+          <w:between w:val="single" w:sz="4" w:space="1" w:color="CDD3D9"/>
+        </w:pBdr>
+        <w:spacing w:before="0" w:after="0" w:line="500" w:lineRule="exact"/>
       </w:pPr>
-      <w:r>
-        <w:rPr>
-          <w:color w:val="CDD3D9"/>
-          <w:sz w:val="18"/>
-        </w:rPr>
-        <w:t>________________________________________________________________________________</w:t>
-      </w:r>
     </w:p>
     <w:p>
       <w:pPr>
-        <w:spacing w:after="40"/>
+        <w:pBdr>
+          <w:bottom w:val="single" w:sz="4" w:space="1" w:color="CDD3D9"/>
+          <w:between w:val="single" w:sz="4" w:space="1" w:color="CDD3D9"/>
+        </w:pBdr>
+        <w:spacing w:before="0" w:after="0" w:line="500" w:lineRule="exact"/>
       </w:pPr>
-      <w:r>
-        <w:rPr>
-          <w:color w:val="CDD3D9"/>
-          <w:sz w:val="18"/>
-        </w:rPr>
-        <w:t>________________________________________________________________________________</w:t>
-      </w:r>
     </w:p>
     <w:p>
       <w:pPr>
-        <w:spacing w:after="40"/>
+        <w:pBdr>
+          <w:bottom w:val="single" w:sz="4" w:space="1" w:color="CDD3D9"/>
+          <w:between w:val="single" w:sz="4" w:space="1" w:color="CDD3D9"/>
+        </w:pBdr>
+        <w:spacing w:before="0" w:after="0" w:line="500" w:lineRule="exact"/>
       </w:pPr>
-      <w:r>
-        <w:rPr>
-          <w:color w:val="CDD3D9"/>
-          <w:sz w:val="18"/>
-        </w:rPr>
-        <w:t>________________________________________________________________________________</w:t>
-      </w:r>
     </w:p>
     <w:p>
       <w:pPr>
-        <w:spacing w:after="40"/>
+        <w:pBdr>
+          <w:bottom w:val="single" w:sz="4" w:space="1" w:color="CDD3D9"/>
+          <w:between w:val="single" w:sz="4" w:space="1" w:color="CDD3D9"/>
+        </w:pBdr>
+        <w:spacing w:before="0" w:after="0" w:line="500" w:lineRule="exact"/>
       </w:pPr>
-      <w:r>
-        <w:rPr>
-          <w:color w:val="CDD3D9"/>
-          <w:sz w:val="18"/>
-        </w:rPr>
-        <w:t>________________________________________________________________________________</w:t>
-      </w:r>
+    </w:p>
+    <w:p>
+      <w:pPr>
+        <w:spacing w:after="0" w:line="140" w:lineRule="exact"/>
+      </w:pPr>
     </w:p>
     <w:p>
       <w:r>
@@ -2493,99 +2562,98 @@
     </w:p>
     <w:p>
       <w:pPr>
-        <w:spacing w:after="40"/>
+        <w:pBdr>
+          <w:bottom w:val="single" w:sz="4" w:space="1" w:color="CDD3D9"/>
+          <w:between w:val="single" w:sz="4" w:space="1" w:color="CDD3D9"/>
+        </w:pBdr>
+        <w:spacing w:before="0" w:after="0" w:line="500" w:lineRule="exact"/>
       </w:pPr>
-      <w:r>
-        <w:rPr>
-          <w:color w:val="CDD3D9"/>
-          <w:sz w:val="18"/>
-        </w:rPr>
-        <w:t>________________________________________________________________________________</w:t>
-      </w:r>
     </w:p>
     <w:p>
       <w:pPr>
-        <w:spacing w:after="40"/>
+        <w:pBdr>
+          <w:bottom w:val="single" w:sz="4" w:space="1" w:color="CDD3D9"/>
+          <w:between w:val="single" w:sz="4" w:space="1" w:color="CDD3D9"/>
+        </w:pBdr>
+        <w:spacing w:before="0" w:after="0" w:line="500" w:lineRule="exact"/>
       </w:pPr>
-      <w:r>
-        <w:rPr>
-          <w:color w:val="CDD3D9"/>
-          <w:sz w:val="18"/>
-        </w:rPr>
-        <w:t>________________________________________________________________________________</w:t>
-      </w:r>
     </w:p>
     <w:p>
       <w:pPr>
-        <w:spacing w:after="40"/>
+        <w:pBdr>
+          <w:bottom w:val="single" w:sz="4" w:space="1" w:color="CDD3D9"/>
+          <w:between w:val="single" w:sz="4" w:space="1" w:color="CDD3D9"/>
+        </w:pBdr>
+        <w:spacing w:before="0" w:after="0" w:line="500" w:lineRule="exact"/>
       </w:pPr>
-      <w:r>
-        <w:rPr>
-          <w:color w:val="CDD3D9"/>
-          <w:sz w:val="18"/>
-        </w:rPr>
-        <w:t>________________________________________________________________________________</w:t>
-      </w:r>
     </w:p>
     <w:p>
       <w:pPr>
-        <w:spacing w:after="40"/>
+        <w:pBdr>
+          <w:bottom w:val="single" w:sz="4" w:space="1" w:color="CDD3D9"/>
+          <w:between w:val="single" w:sz="4" w:space="1" w:color="CDD3D9"/>
+        </w:pBdr>
+        <w:spacing w:before="0" w:after="0" w:line="500" w:lineRule="exact"/>
       </w:pPr>
-      <w:r>
-        <w:rPr>
-          <w:color w:val="CDD3D9"/>
-          <w:sz w:val="18"/>
-        </w:rPr>
-        <w:t>________________________________________________________________________________</w:t>
-      </w:r>
     </w:p>
     <w:p>
       <w:pPr>
-        <w:spacing w:after="40"/>
+        <w:pBdr>
+          <w:bottom w:val="single" w:sz="4" w:space="1" w:color="CDD3D9"/>
+          <w:between w:val="single" w:sz="4" w:space="1" w:color="CDD3D9"/>
+        </w:pBdr>
+        <w:spacing w:before="0" w:after="0" w:line="500" w:lineRule="exact"/>
       </w:pPr>
-      <w:r>
-        <w:rPr>
-          <w:color w:val="CDD3D9"/>
-          <w:sz w:val="18"/>
-        </w:rPr>
-        <w:t>________________________________________________________________________________</w:t>
-      </w:r>
     </w:p>
     <w:p>
       <w:pPr>
-        <w:spacing w:after="40"/>
+        <w:pBdr>
+          <w:bottom w:val="single" w:sz="4" w:space="1" w:color="CDD3D9"/>
+          <w:between w:val="single" w:sz="4" w:space="1" w:color="CDD3D9"/>
+        </w:pBdr>
+        <w:spacing w:before="0" w:after="0" w:line="500" w:lineRule="exact"/>
       </w:pPr>
-      <w:r>
-        <w:rPr>
-          <w:color w:val="CDD3D9"/>
-          <w:sz w:val="18"/>
-        </w:rPr>
-        <w:t>________________________________________________________________________________</w:t>
-      </w:r>
     </w:p>
     <w:p>
       <w:pPr>
-        <w:spacing w:after="40"/>
+        <w:pBdr>
+          <w:bottom w:val="single" w:sz="4" w:space="1" w:color="CDD3D9"/>
+          <w:between w:val="single" w:sz="4" w:space="1" w:color="CDD3D9"/>
+        </w:pBdr>
+        <w:spacing w:before="0" w:after="0" w:line="500" w:lineRule="exact"/>
       </w:pPr>
-      <w:r>
-        <w:rPr>
-          <w:color w:val="CDD3D9"/>
-          <w:sz w:val="18"/>
-        </w:rPr>
-        <w:t>________________________________________________________________________________</w:t>
-      </w:r>
     </w:p>
     <w:p>
       <w:pPr>
-        <w:spacing w:after="40"/>
+        <w:pBdr>
+          <w:bottom w:val="single" w:sz="4" w:space="1" w:color="CDD3D9"/>
+          <w:between w:val="single" w:sz="4" w:space="1" w:color="CDD3D9"/>
+        </w:pBdr>
+        <w:spacing w:before="0" w:after="0" w:line="500" w:lineRule="exact"/>
       </w:pPr>
-      <w:r>
-        <w:rPr>
-          <w:color w:val="CDD3D9"/>
-          <w:sz w:val="18"/>
-        </w:rPr>
-        <w:t>________________________________________________________________________________</w:t>
-      </w:r>
+    </w:p>
+    <w:p>
+      <w:pPr>
+        <w:pBdr>
+          <w:bottom w:val="single" w:sz="4" w:space="1" w:color="CDD3D9"/>
+          <w:between w:val="single" w:sz="4" w:space="1" w:color="CDD3D9"/>
+        </w:pBdr>
+        <w:spacing w:before="0" w:after="0" w:line="500" w:lineRule="exact"/>
+      </w:pPr>
+    </w:p>
+    <w:p>
+      <w:pPr>
+        <w:pBdr>
+          <w:bottom w:val="single" w:sz="4" w:space="1" w:color="CDD3D9"/>
+          <w:between w:val="single" w:sz="4" w:space="1" w:color="CDD3D9"/>
+        </w:pBdr>
+        <w:spacing w:before="0" w:after="0" w:line="500" w:lineRule="exact"/>
+      </w:pPr>
+    </w:p>
+    <w:p>
+      <w:pPr>
+        <w:spacing w:after="0" w:line="140" w:lineRule="exact"/>
+      </w:pPr>
     </w:p>
     <w:p>
       <w:pPr>
@@ -2607,27 +2675,35 @@
     </w:p>
     <w:p>
       <w:pPr>
-        <w:spacing w:after="40"/>
+        <w:pBdr>
+          <w:bottom w:val="single" w:sz="4" w:space="1" w:color="CDD3D9"/>
+          <w:between w:val="single" w:sz="4" w:space="1" w:color="CDD3D9"/>
+        </w:pBdr>
+        <w:spacing w:before="0" w:after="0" w:line="500" w:lineRule="exact"/>
       </w:pPr>
-      <w:r>
-        <w:rPr>
-          <w:color w:val="CDD3D9"/>
-          <w:sz w:val="18"/>
-        </w:rPr>
-        <w:t>________________________________________________________________________________</w:t>
-      </w:r>
     </w:p>
     <w:p>
       <w:pPr>
-        <w:spacing w:after="40"/>
+        <w:pBdr>
+          <w:bottom w:val="single" w:sz="4" w:space="1" w:color="CDD3D9"/>
+          <w:between w:val="single" w:sz="4" w:space="1" w:color="CDD3D9"/>
+        </w:pBdr>
+        <w:spacing w:before="0" w:after="0" w:line="500" w:lineRule="exact"/>
       </w:pPr>
-      <w:r>
-        <w:rPr>
-          <w:color w:val="CDD3D9"/>
-          <w:sz w:val="18"/>
-        </w:rPr>
-        <w:t>________________________________________________________________________________</w:t>
-      </w:r>
+    </w:p>
+    <w:p>
+      <w:pPr>
+        <w:pBdr>
+          <w:bottom w:val="single" w:sz="4" w:space="1" w:color="CDD3D9"/>
+          <w:between w:val="single" w:sz="4" w:space="1" w:color="CDD3D9"/>
+        </w:pBdr>
+        <w:spacing w:before="0" w:after="0" w:line="500" w:lineRule="exact"/>
+      </w:pPr>
+    </w:p>
+    <w:p>
+      <w:pPr>
+        <w:spacing w:after="0" w:line="140" w:lineRule="exact"/>
+      </w:pPr>
     </w:p>
     <w:p>
       <w:r>
@@ -2636,48 +2712,78 @@
     </w:p>
     <w:p>
       <w:pPr>
-        <w:spacing w:after="40"/>
+        <w:pBdr>
+          <w:bottom w:val="single" w:sz="4" w:space="1" w:color="CDD3D9"/>
+          <w:between w:val="single" w:sz="4" w:space="1" w:color="CDD3D9"/>
+        </w:pBdr>
+        <w:spacing w:before="0" w:after="0" w:line="500" w:lineRule="exact"/>
       </w:pPr>
-      <w:r>
-        <w:rPr>
-          <w:color w:val="CDD3D9"/>
-          <w:sz w:val="18"/>
-        </w:rPr>
-        <w:t>________________________________________________________________________________</w:t>
-      </w:r>
     </w:p>
     <w:p>
       <w:pPr>
-        <w:spacing w:after="40"/>
+        <w:pBdr>
+          <w:bottom w:val="single" w:sz="4" w:space="1" w:color="CDD3D9"/>
+          <w:between w:val="single" w:sz="4" w:space="1" w:color="CDD3D9"/>
+        </w:pBdr>
+        <w:spacing w:before="0" w:after="0" w:line="500" w:lineRule="exact"/>
       </w:pPr>
-      <w:r>
-        <w:rPr>
-          <w:color w:val="CDD3D9"/>
-          <w:sz w:val="18"/>
-        </w:rPr>
-        <w:t>________________________________________________________________________________</w:t>
-      </w:r>
     </w:p>
     <w:p>
       <w:pPr>
-        <w:spacing w:after="40"/>
+        <w:pBdr>
+          <w:bottom w:val="single" w:sz="4" w:space="1" w:color="CDD3D9"/>
+          <w:between w:val="single" w:sz="4" w:space="1" w:color="CDD3D9"/>
+        </w:pBdr>
+        <w:spacing w:before="0" w:after="0" w:line="500" w:lineRule="exact"/>
       </w:pPr>
-      <w:r>
-        <w:rPr>
-          <w:color w:val="CDD3D9"/>
-          <w:sz w:val="18"/>
-        </w:rPr>
-        <w:t>________________________________________________________________________________</w:t>
-      </w:r>
+    </w:p>
+    <w:p>
+      <w:pPr>
+        <w:pBdr>
+          <w:bottom w:val="single" w:sz="4" w:space="1" w:color="CDD3D9"/>
+          <w:between w:val="single" w:sz="4" w:space="1" w:color="CDD3D9"/>
+        </w:pBdr>
+        <w:spacing w:before="0" w:after="0" w:line="500" w:lineRule="exact"/>
+      </w:pPr>
+    </w:p>
+    <w:p>
+      <w:pPr>
+        <w:spacing w:after="0" w:line="140" w:lineRule="exact"/>
+      </w:pPr>
     </w:p>
     <w:sectPr>
-      <w:pgSz w:w="12240" w:h="15840"/>
+      <w:footerReference w:type="default" r:id="rId9"/>
+      <w:pgSz w:w="11906" w:h="16838"/>
       <w:pgMar w:top="648" w:right="864" w:bottom="835" w:left="864" w:header="720" w:footer="720" w:gutter="0"/>
       <w:cols w:space="720"/>
       <w:docGrid w:linePitch="360"/>
     </w:sectPr>
   </w:body>
 </w:document>
+</file>
+
+<file path=word/footer1.xml><?xml version="1.0" encoding="utf-8"?>
+<w:ftr xmlns:m="http://schemas.openxmlformats.org/officeDocument/2006/math" xmlns:mc="http://schemas.openxmlformats.org/markup-compatibility/2006" xmlns:mo="http://schemas.microsoft.com/office/mac/office/2008/main" xmlns:mv="urn:schemas-microsoft-com:mac:vml" xmlns:o="urn:schemas-microsoft-com:office:office" xmlns:r="http://schemas.openxmlformats.org/officeDocument/2006/relationships" xmlns:v="urn:schemas-microsoft-com:vml" xmlns:w10="urn:schemas-microsoft-com:office:word" xmlns:w14="http://schemas.microsoft.com/office/word/2010/wordml" xmlns:w="http://schemas.openxmlformats.org/wordprocessingml/2006/main" xmlns:wne="http://schemas.microsoft.com/office/word/2006/wordml" xmlns:wp14="http://schemas.microsoft.com/office/word/2010/wordprocessingDrawing" xmlns:wp="http://schemas.openxmlformats.org/drawingml/2006/wordprocessingDrawing" xmlns:wpc="http://schemas.microsoft.com/office/word/2010/wordprocessingCanvas" xmlns:wpg="http://schemas.microsoft.com/office/word/2010/wordprocessingGroup" xmlns:wpi="http://schemas.microsoft.com/office/word/2010/wordprocessingInk" xmlns:wps="http://schemas.microsoft.com/office/word/2010/wordprocessingShape" mc:Ignorable="w14 wp14">
+  <w:p>
+    <w:pPr>
+      <w:pStyle w:val="Footer"/>
+    </w:pPr>
+    <w:r>
+      <w:rPr>
+        <w:sz w:val="16"/>
+      </w:rPr>
+      <w:t xml:space="preserve">TBS-BV-20261009-v1.4 | THE BUSINESS SCHOOL | page </w:t>
+    </w:r>
+    <w:fldSimple w:instr="PAGE">
+      <w:r>
+        <w:rPr>
+          <w:sz w:val="16"/>
+        </w:rPr>
+        <w:t>1</w:t>
+      </w:r>
+    </w:fldSimple>
+  </w:p>
+</w:ftr>
 </file>
 
 <file path=word/numbering.xml><?xml version="1.0" encoding="utf-8"?>
@@ -3107,7 +3213,7 @@
     <w:pPr>
       <w:keepNext/>
       <w:keepLines/>
-      <w:spacing w:before="480" w:after="0"/>
+      <w:spacing w:before="240" w:after="0"/>
       <w:outlineLvl w:val="0"/>
     </w:pPr>
     <w:rPr>

</xml_diff>